<commit_message>
Replace synthetic datasets with real Pima Indians Diabetes data across Module 1
Labs 03-05 now train on the 8-feature Pima Indians Diabetes dataset instead
of make_circles/make_moons, with 2D decision-boundary plots swapped for
confusion matrix + ROC curve evaluation. Labs 01-02 (which never trained on
a dataset) gain a new bonus section applying their built functions to the
same real data. Updated all 5 practice guides and regenerated the matching
DOCX files to reflect the new datasets, architectures, and results.
</commit_message>
<xml_diff>
--- a/Deep Learning/Module 1/tài liệu thực hành/01_Kien-truc-DNN-va-Backpropagation/01_Kien-truc-DNN-va-Backpropagation.docx
+++ b/Deep Learning/Module 1/tài liệu thực hành/01_Kien-truc-DNN-va-Backpropagation/01_Kien-truc-DNN-va-Backpropagation.docx
@@ -3482,7 +3482,470 @@
           <w:b w:val="0"/>
           <w:i w:val="0"/>
         </w:rPr>
-        <w:t>7. Bài tập mở rộng</w:t>
+        <w:t>7. [Bonus] Áp dụng vào dữ liệu thật</w:t>
+      </w:r>
+    </w:p>
+    <w:p>
+      <w:r>
+        <w:rPr>
+          <w:rFonts w:ascii="Calibri" w:hAnsi="Calibri"/>
+          <w:b w:val="0"/>
+          <w:i w:val="0"/>
+        </w:rPr>
+        <w:t xml:space="preserve">Notebook có thêm mục </w:t>
+      </w:r>
+      <w:r>
+        <w:rPr>
+          <w:rFonts w:ascii="Calibri" w:hAnsi="Calibri"/>
+          <w:b/>
+          <w:i w:val="0"/>
+        </w:rPr>
+        <w:t>"11. [Bonus] Áp dụng vào dữ liệu thật"</w:t>
+      </w:r>
+      <w:r>
+        <w:rPr>
+          <w:rFonts w:ascii="Calibri" w:hAnsi="Calibri"/>
+          <w:b w:val="0"/>
+          <w:i w:val="0"/>
+        </w:rPr>
+        <w:t xml:space="preserve"> ở cuối (sau cell "Congratulations!") — dùng chính các hàm vừa cài (</w:t>
+      </w:r>
+      <w:r>
+        <w:rPr>
+          <w:rFonts w:ascii="Consolas" w:hAnsi="Consolas"/>
+          <w:b w:val="0"/>
+          <w:i w:val="0"/>
+          <w:sz w:val="20"/>
+        </w:rPr>
+        <w:t>initialize_parameters_deep</w:t>
+      </w:r>
+      <w:r>
+        <w:rPr>
+          <w:rFonts w:ascii="Calibri" w:hAnsi="Calibri"/>
+          <w:b w:val="0"/>
+          <w:i w:val="0"/>
+        </w:rPr>
+        <w:t xml:space="preserve">, </w:t>
+      </w:r>
+      <w:r>
+        <w:rPr>
+          <w:rFonts w:ascii="Consolas" w:hAnsi="Consolas"/>
+          <w:b w:val="0"/>
+          <w:i w:val="0"/>
+          <w:sz w:val="20"/>
+        </w:rPr>
+        <w:t>L_model_forward</w:t>
+      </w:r>
+      <w:r>
+        <w:rPr>
+          <w:rFonts w:ascii="Calibri" w:hAnsi="Calibri"/>
+          <w:b w:val="0"/>
+          <w:i w:val="0"/>
+        </w:rPr>
+        <w:t xml:space="preserve">, </w:t>
+      </w:r>
+      <w:r>
+        <w:rPr>
+          <w:rFonts w:ascii="Consolas" w:hAnsi="Consolas"/>
+          <w:b w:val="0"/>
+          <w:i w:val="0"/>
+          <w:sz w:val="20"/>
+        </w:rPr>
+        <w:t>compute_cost</w:t>
+      </w:r>
+      <w:r>
+        <w:rPr>
+          <w:rFonts w:ascii="Calibri" w:hAnsi="Calibri"/>
+          <w:b w:val="0"/>
+          <w:i w:val="0"/>
+        </w:rPr>
+        <w:t xml:space="preserve">, </w:t>
+      </w:r>
+      <w:r>
+        <w:rPr>
+          <w:rFonts w:ascii="Consolas" w:hAnsi="Consolas"/>
+          <w:b w:val="0"/>
+          <w:i w:val="0"/>
+          <w:sz w:val="20"/>
+        </w:rPr>
+        <w:t>L_model_backward</w:t>
+      </w:r>
+      <w:r>
+        <w:rPr>
+          <w:rFonts w:ascii="Calibri" w:hAnsi="Calibri"/>
+          <w:b w:val="0"/>
+          <w:i w:val="0"/>
+        </w:rPr>
+        <w:t xml:space="preserve">, </w:t>
+      </w:r>
+      <w:r>
+        <w:rPr>
+          <w:rFonts w:ascii="Consolas" w:hAnsi="Consolas"/>
+          <w:b w:val="0"/>
+          <w:i w:val="0"/>
+          <w:sz w:val="20"/>
+        </w:rPr>
+        <w:t>update_parameters</w:t>
+      </w:r>
+      <w:r>
+        <w:rPr>
+          <w:rFonts w:ascii="Calibri" w:hAnsi="Calibri"/>
+          <w:b w:val="0"/>
+          <w:i w:val="0"/>
+        </w:rPr>
+        <w:t xml:space="preserve">) để lắp thành một hàm huấn luyện đầy đủ </w:t>
+      </w:r>
+      <w:r>
+        <w:rPr>
+          <w:rFonts w:ascii="Consolas" w:hAnsi="Consolas"/>
+          <w:b w:val="0"/>
+          <w:i w:val="0"/>
+          <w:sz w:val="20"/>
+        </w:rPr>
+        <w:t>L_layer_model(X, Y, layers_dims, learning_rate, num_iterations, print_cost)</w:t>
+      </w:r>
+      <w:r>
+        <w:rPr>
+          <w:rFonts w:ascii="Calibri" w:hAnsi="Calibri"/>
+          <w:b w:val="0"/>
+          <w:i w:val="0"/>
+        </w:rPr>
+        <w:t xml:space="preserve">, rồi train trên bộ dữ liệu y tế thật </w:t>
+      </w:r>
+      <w:r>
+        <w:rPr>
+          <w:rFonts w:ascii="Calibri" w:hAnsi="Calibri"/>
+          <w:b/>
+          <w:i w:val="0"/>
+        </w:rPr>
+        <w:t>Pima Indians Diabetes</w:t>
+      </w:r>
+      <w:r>
+        <w:rPr>
+          <w:rFonts w:ascii="Calibri" w:hAnsi="Calibri"/>
+          <w:b w:val="0"/>
+          <w:i w:val="0"/>
+        </w:rPr>
+        <w:t xml:space="preserve"> (768 bệnh nhân, 8 đặc trưng lâm sàng, dự đoán tiểu đường) qua </w:t>
+      </w:r>
+      <w:r>
+        <w:rPr>
+          <w:rFonts w:ascii="Consolas" w:hAnsi="Consolas"/>
+          <w:b w:val="0"/>
+          <w:i w:val="0"/>
+          <w:sz w:val="20"/>
+        </w:rPr>
+        <w:t>load_dataset()</w:t>
+      </w:r>
+      <w:r>
+        <w:rPr>
+          <w:rFonts w:ascii="Calibri" w:hAnsi="Calibri"/>
+          <w:b w:val="0"/>
+          <w:i w:val="0"/>
+        </w:rPr>
+        <w:t xml:space="preserve"> — cùng bộ dữ liệu và cách tiền xử lý sẽ dùng lại xuyên suốt các bài 03–05.</w:t>
+      </w:r>
+    </w:p>
+    <w:tbl>
+      <w:tblPr>
+        <w:tblStyle w:val="TableGrid"/>
+        <w:tblW w:type="auto" w:w="0"/>
+        <w:jc w:val="center"/>
+        <w:tblLayout w:type="autofit"/>
+        <w:tblLook w:firstColumn="1" w:firstRow="1" w:lastColumn="0" w:lastRow="0" w:noHBand="0" w:noVBand="1" w:val="04A0"/>
+      </w:tblPr>
+      <w:tblGrid>
+        <w:gridCol w:w="4873"/>
+        <w:gridCol w:w="4873"/>
+      </w:tblGrid>
+      <w:tr>
+        <w:tc>
+          <w:tcPr>
+            <w:tcW w:type="dxa" w:w="4873"/>
+            <w:shd w:val="clear" w:color="auto" w:fill="D9E2F3"/>
+          </w:tcPr>
+          <w:p>
+            <w:r>
+              <w:rPr>
+                <w:b/>
+              </w:rPr>
+            </w:r>
+            <w:r>
+              <w:rPr>
+                <w:rFonts w:ascii="Calibri" w:hAnsi="Calibri"/>
+                <w:b/>
+                <w:i w:val="0"/>
+              </w:rPr>
+              <w:t>Thành phần</w:t>
+            </w:r>
+          </w:p>
+        </w:tc>
+        <w:tc>
+          <w:tcPr>
+            <w:tcW w:type="dxa" w:w="4873"/>
+            <w:shd w:val="clear" w:color="auto" w:fill="D9E2F3"/>
+          </w:tcPr>
+          <w:p>
+            <w:r>
+              <w:rPr>
+                <w:b/>
+              </w:rPr>
+            </w:r>
+            <w:r>
+              <w:rPr>
+                <w:rFonts w:ascii="Calibri" w:hAnsi="Calibri"/>
+                <w:b/>
+                <w:i w:val="0"/>
+              </w:rPr>
+              <w:t>Giá trị</w:t>
+            </w:r>
+          </w:p>
+        </w:tc>
+      </w:tr>
+      <w:tr>
+        <w:tc>
+          <w:tcPr>
+            <w:tcW w:type="dxa" w:w="4873"/>
+          </w:tcPr>
+          <w:p>
+            <w:r/>
+            <w:r>
+              <w:rPr>
+                <w:rFonts w:ascii="Calibri" w:hAnsi="Calibri"/>
+                <w:b w:val="0"/>
+                <w:i w:val="0"/>
+              </w:rPr>
+              <w:t>Kiến trúc</w:t>
+            </w:r>
+          </w:p>
+        </w:tc>
+        <w:tc>
+          <w:tcPr>
+            <w:tcW w:type="dxa" w:w="4873"/>
+          </w:tcPr>
+          <w:p>
+            <w:r/>
+            <w:r>
+              <w:rPr>
+                <w:rFonts w:ascii="Consolas" w:hAnsi="Consolas"/>
+                <w:b w:val="0"/>
+                <w:i w:val="0"/>
+                <w:sz w:val="20"/>
+              </w:rPr>
+              <w:t>layers_dims = [train_X.shape[0], 7, 1] = [8, 7, 1]</w:t>
+            </w:r>
+            <w:r>
+              <w:rPr>
+                <w:rFonts w:ascii="Calibri" w:hAnsi="Calibri"/>
+                <w:b w:val="0"/>
+                <w:i w:val="0"/>
+              </w:rPr>
+              <w:t xml:space="preserve"> (1 hidden layer)</w:t>
+            </w:r>
+          </w:p>
+        </w:tc>
+      </w:tr>
+      <w:tr>
+        <w:tc>
+          <w:tcPr>
+            <w:tcW w:type="dxa" w:w="4873"/>
+          </w:tcPr>
+          <w:p>
+            <w:r/>
+            <w:r>
+              <w:rPr>
+                <w:rFonts w:ascii="Calibri" w:hAnsi="Calibri"/>
+                <w:b w:val="0"/>
+                <w:i w:val="0"/>
+              </w:rPr>
+              <w:t>Learning rate</w:t>
+            </w:r>
+          </w:p>
+        </w:tc>
+        <w:tc>
+          <w:tcPr>
+            <w:tcW w:type="dxa" w:w="4873"/>
+          </w:tcPr>
+          <w:p>
+            <w:r/>
+            <w:r>
+              <w:rPr>
+                <w:rFonts w:ascii="Consolas" w:hAnsi="Consolas"/>
+                <w:b w:val="0"/>
+                <w:i w:val="0"/>
+                <w:sz w:val="20"/>
+              </w:rPr>
+              <w:t>0.5</w:t>
+            </w:r>
+          </w:p>
+        </w:tc>
+      </w:tr>
+      <w:tr>
+        <w:tc>
+          <w:tcPr>
+            <w:tcW w:type="dxa" w:w="4873"/>
+          </w:tcPr>
+          <w:p>
+            <w:r/>
+            <w:r>
+              <w:rPr>
+                <w:rFonts w:ascii="Calibri" w:hAnsi="Calibri"/>
+                <w:b w:val="0"/>
+                <w:i w:val="0"/>
+              </w:rPr>
+              <w:t>Số iteration</w:t>
+            </w:r>
+          </w:p>
+        </w:tc>
+        <w:tc>
+          <w:tcPr>
+            <w:tcW w:type="dxa" w:w="4873"/>
+          </w:tcPr>
+          <w:p>
+            <w:r/>
+            <w:r>
+              <w:rPr>
+                <w:rFonts w:ascii="Consolas" w:hAnsi="Consolas"/>
+                <w:b w:val="0"/>
+                <w:i w:val="0"/>
+                <w:sz w:val="20"/>
+              </w:rPr>
+              <w:t>3000</w:t>
+            </w:r>
+          </w:p>
+        </w:tc>
+      </w:tr>
+      <w:tr>
+        <w:tc>
+          <w:tcPr>
+            <w:tcW w:type="dxa" w:w="4873"/>
+          </w:tcPr>
+          <w:p>
+            <w:r/>
+            <w:r>
+              <w:rPr>
+                <w:rFonts w:ascii="Calibri" w:hAnsi="Calibri"/>
+                <w:b w:val="0"/>
+                <w:i w:val="0"/>
+              </w:rPr>
+              <w:t>Kết quả</w:t>
+            </w:r>
+          </w:p>
+        </w:tc>
+        <w:tc>
+          <w:tcPr>
+            <w:tcW w:type="dxa" w:w="4873"/>
+          </w:tcPr>
+          <w:p>
+            <w:r/>
+            <w:r>
+              <w:rPr>
+                <w:rFonts w:ascii="Calibri" w:hAnsi="Calibri"/>
+                <w:b w:val="0"/>
+                <w:i w:val="0"/>
+              </w:rPr>
+              <w:t xml:space="preserve">Train accuracy ≈ </w:t>
+            </w:r>
+            <w:r>
+              <w:rPr>
+                <w:rFonts w:ascii="Calibri" w:hAnsi="Calibri"/>
+                <w:b/>
+                <w:i w:val="0"/>
+              </w:rPr>
+              <w:t>83.1%</w:t>
+            </w:r>
+            <w:r>
+              <w:rPr>
+                <w:rFonts w:ascii="Calibri" w:hAnsi="Calibri"/>
+                <w:b w:val="0"/>
+                <w:i w:val="0"/>
+              </w:rPr>
+              <w:t xml:space="preserve">, Test accuracy ≈ </w:t>
+            </w:r>
+            <w:r>
+              <w:rPr>
+                <w:rFonts w:ascii="Calibri" w:hAnsi="Calibri"/>
+                <w:b/>
+                <w:i w:val="0"/>
+              </w:rPr>
+              <w:t>74.0%</w:t>
+            </w:r>
+          </w:p>
+        </w:tc>
+      </w:tr>
+    </w:tbl>
+    <w:p/>
+    <w:p>
+      <w:r>
+        <w:rPr>
+          <w:rFonts w:ascii="Calibri" w:hAnsi="Calibri"/>
+          <w:b w:val="0"/>
+          <w:i w:val="0"/>
+        </w:rPr>
+        <w:t xml:space="preserve">Đây chỉ là bản demo đơn giản (1 hidden layer, khởi tạo </w:t>
+      </w:r>
+      <w:r>
+        <w:rPr>
+          <w:rFonts w:ascii="Consolas" w:hAnsi="Consolas"/>
+          <w:b w:val="0"/>
+          <w:i w:val="0"/>
+          <w:sz w:val="20"/>
+        </w:rPr>
+        <w:t>*0.01</w:t>
+      </w:r>
+      <w:r>
+        <w:rPr>
+          <w:rFonts w:ascii="Calibri" w:hAnsi="Calibri"/>
+          <w:b w:val="0"/>
+          <w:i w:val="0"/>
+        </w:rPr>
+        <w:t xml:space="preserve"> mặc định) — thử tăng lên mạng sâu hơn (vd </w:t>
+      </w:r>
+      <w:r>
+        <w:rPr>
+          <w:rFonts w:ascii="Consolas" w:hAnsi="Consolas"/>
+          <w:b w:val="0"/>
+          <w:i w:val="0"/>
+          <w:sz w:val="20"/>
+        </w:rPr>
+        <w:t>[8, 20, 7, 5, 1]</w:t>
+      </w:r>
+      <w:r>
+        <w:rPr>
+          <w:rFonts w:ascii="Calibri" w:hAnsi="Calibri"/>
+          <w:b w:val="0"/>
+          <w:i w:val="0"/>
+        </w:rPr>
+        <w:t xml:space="preserve">) sẽ thấy accuracy tụt lại ngang baseline (~65%, tức đoán toàn bộ về lớp đa số) do vanishing gradient với cách khởi tạo ngây thơ này. Đây chính là vấn đề mà </w:t>
+      </w:r>
+      <w:r>
+        <w:rPr>
+          <w:rFonts w:ascii="Calibri" w:hAnsi="Calibri"/>
+          <w:b/>
+          <w:i w:val="0"/>
+        </w:rPr>
+        <w:t>bài 03</w:t>
+      </w:r>
+      <w:r>
+        <w:rPr>
+          <w:rFonts w:ascii="Calibri" w:hAnsi="Calibri"/>
+          <w:b w:val="0"/>
+          <w:i w:val="0"/>
+        </w:rPr>
+        <w:t xml:space="preserve"> sẽ giải quyết bằng khởi tạo He/Xavier.</w:t>
+      </w:r>
+    </w:p>
+    <w:p>
+      <w:pPr>
+        <w:pStyle w:val="Heading2"/>
+      </w:pPr>
+      <w:r>
+        <w:rPr>
+          <w:rFonts w:ascii="Calibri" w:hAnsi="Calibri"/>
+          <w:b w:val="0"/>
+          <w:i w:val="0"/>
+        </w:rPr>
+        <w:t>8. Bài tập mở rộng</w:t>
       </w:r>
     </w:p>
     <w:p>
@@ -3822,6 +4285,44 @@
     </w:p>
     <w:p>
       <w:pPr>
+        <w:pStyle w:val="ListNumber"/>
+      </w:pPr>
+      <w:r>
+        <w:rPr>
+          <w:rFonts w:ascii="Calibri" w:hAnsi="Calibri"/>
+          <w:b/>
+          <w:i w:val="0"/>
+        </w:rPr>
+        <w:t>Kiểm chứng nhận định "mạng sâu hơn sẽ tệ hơn":</w:t>
+      </w:r>
+      <w:r>
+        <w:rPr>
+          <w:rFonts w:ascii="Calibri" w:hAnsi="Calibri"/>
+          <w:b w:val="0"/>
+          <w:i w:val="0"/>
+        </w:rPr>
+        <w:t xml:space="preserve"> tự thử </w:t>
+      </w:r>
+      <w:r>
+        <w:rPr>
+          <w:rFonts w:ascii="Consolas" w:hAnsi="Consolas"/>
+          <w:b w:val="0"/>
+          <w:i w:val="0"/>
+          <w:sz w:val="20"/>
+        </w:rPr>
+        <w:t>layers_dims = [8, 20, 7, 5, 1]</w:t>
+      </w:r>
+      <w:r>
+        <w:rPr>
+          <w:rFonts w:ascii="Calibri" w:hAnsi="Calibri"/>
+          <w:b w:val="0"/>
+          <w:i w:val="0"/>
+        </w:rPr>
+        <w:t xml:space="preserve"> trong mục Bonus với nhiều learning rate khác nhau (0.01 đến 0.75), xác nhận accuracy không vượt qua baseline — rồi so sánh với kết quả sau khi áp dụng He initialization ở bài 03.</w:t>
+      </w:r>
+    </w:p>
+    <w:p>
+      <w:pPr>
         <w:pStyle w:val="Heading2"/>
       </w:pPr>
       <w:r>
@@ -3830,7 +4331,7 @@
           <w:b w:val="0"/>
           <w:i w:val="0"/>
         </w:rPr>
-        <w:t>8. Tài liệu bổ sung</w:t>
+        <w:t>9. Tài liệu bổ sung</w:t>
       </w:r>
     </w:p>
     <w:tbl>
@@ -3997,6 +4498,42 @@
           </w:p>
         </w:tc>
       </w:tr>
+      <w:tr>
+        <w:tc>
+          <w:tcPr>
+            <w:tcW w:type="dxa" w:w="4873"/>
+          </w:tcPr>
+          <w:p>
+            <w:r/>
+            <w:r>
+              <w:rPr>
+                <w:rFonts w:ascii="Calibri" w:hAnsi="Calibri"/>
+                <w:b w:val="0"/>
+                <w:i w:val="0"/>
+              </w:rPr>
+              <w:t>Pima Indians Diabetes Dataset (nguồn gốc)</w:t>
+            </w:r>
+          </w:p>
+        </w:tc>
+        <w:tc>
+          <w:tcPr>
+            <w:tcW w:type="dxa" w:w="4873"/>
+          </w:tcPr>
+          <w:p>
+            <w:r/>
+            <w:hyperlink r:id="rId12">
+              <w:r>
+                <w:rPr>
+                  <w:rFonts w:ascii="Calibri" w:hAnsi="Calibri"/>
+                  <w:color w:val="0563C1"/>
+                  <w:u w:val="single"/>
+                </w:rPr>
+                <w:t>https://www.kaggle.com/datasets/uciml/pima-indians-diabetes-database</w:t>
+              </w:r>
+            </w:hyperlink>
+          </w:p>
+        </w:tc>
+      </w:tr>
     </w:tbl>
     <w:p/>
     <w:p>
@@ -4009,7 +4546,7 @@
           <w:b w:val="0"/>
           <w:i w:val="0"/>
         </w:rPr>
-        <w:t>9. Lưu ý khi kiểm tra bài trước khi nộp</w:t>
+        <w:t>10. Lưu ý khi kiểm tra bài trước khi nộp</w:t>
       </w:r>
     </w:p>
     <w:p>
@@ -4051,7 +4588,7 @@
           <w:b w:val="0"/>
           <w:i w:val="0"/>
         </w:rPr>
-        <w:t xml:space="preserve">Dữ liệu chỉ là mảng số cố định trong </w:t>
+        <w:t xml:space="preserve">Dữ liệu chính chỉ là mảng số cố định trong </w:t>
       </w:r>
       <w:r>
         <w:rPr>
@@ -4068,7 +4605,24 @@
           <w:b w:val="0"/>
           <w:i w:val="0"/>
         </w:rPr>
-        <w:t>, không phải dữ liệu thật → không có rủi ro data leakage.</w:t>
+        <w:t xml:space="preserve">, không phải dữ liệu thật → không có rủi ro data leakage. Riêng mục Bonus (mục 7) dùng dữ liệu Pima Diabetes thật với train/test tách rõ trong </w:t>
+      </w:r>
+      <w:r>
+        <w:rPr>
+          <w:rFonts w:ascii="Consolas" w:hAnsi="Consolas"/>
+          <w:b w:val="0"/>
+          <w:i w:val="0"/>
+          <w:sz w:val="20"/>
+        </w:rPr>
+        <w:t>load_dataset()</w:t>
+      </w:r>
+      <w:r>
+        <w:rPr>
+          <w:rFonts w:ascii="Calibri" w:hAnsi="Calibri"/>
+          <w:b w:val="0"/>
+          <w:i w:val="0"/>
+        </w:rPr>
+        <w:t>.</w:t>
       </w:r>
     </w:p>
     <w:p>

</xml_diff>